<commit_message>
Update site (2026-07-24 10:34)
</commit_message>
<xml_diff>
--- a/email-psychiatrists-shift-requests.docx
+++ b/email-psychiatrists-shift-requests.docx
@@ -100,7 +100,7 @@
         </w:numPr>
         <w:spacing w:after="60"/>
       </w:pPr>
-      <w:hyperlink w:history="1" r:id="rIdmrpj3dpyp3cls25luq19_">
+      <w:hyperlink w:history="1" r:id="rIdh7tleg5vo7b5gsimgjvfq">
         <w:r>
           <w:rPr>
             <w:rStyle w:val="Hyperlink"/>
@@ -121,7 +121,7 @@
         </w:numPr>
         <w:spacing w:after="60"/>
       </w:pPr>
-      <w:hyperlink w:history="1" r:id="rId16v-iiio2kx-ddg1xqr3f">
+      <w:hyperlink w:history="1" r:id="rIdeqmgi-upg1updr3gonvbk">
         <w:r>
           <w:rPr>
             <w:rStyle w:val="Hyperlink"/>
@@ -142,7 +142,7 @@
         </w:numPr>
         <w:spacing w:after="60"/>
       </w:pPr>
-      <w:hyperlink w:history="1" r:id="rIdn-iewuvsiubned6fyg34h">
+      <w:hyperlink w:history="1" r:id="rIdx4q5o8pfmsfmoyc2c7eg1">
         <w:r>
           <w:rPr>
             <w:rStyle w:val="Hyperlink"/>
@@ -163,7 +163,7 @@
         </w:numPr>
         <w:spacing w:after="60"/>
       </w:pPr>
-      <w:hyperlink w:history="1" r:id="rIdbqqphurzuintuzo1wrcom">
+      <w:hyperlink w:history="1" r:id="rIdfdp1vhxa1thc8bgmc38sh">
         <w:r>
           <w:rPr>
             <w:rStyle w:val="Hyperlink"/>
@@ -184,7 +184,7 @@
         </w:numPr>
         <w:spacing w:after="60"/>
       </w:pPr>
-      <w:hyperlink w:history="1" r:id="rIdq9n9m3ykfyk73pn_r9xvu">
+      <w:hyperlink w:history="1" r:id="rIdvicmmugqzkg57abuwqdnq">
         <w:r>
           <w:rPr>
             <w:rStyle w:val="Hyperlink"/>
@@ -205,7 +205,7 @@
         </w:numPr>
         <w:spacing w:after="60"/>
       </w:pPr>
-      <w:hyperlink w:history="1" r:id="rIdebdkzphzq4f1ylbentuym">
+      <w:hyperlink w:history="1" r:id="rId3visf0dbklqdxcsqk7a0r">
         <w:r>
           <w:rPr>
             <w:rStyle w:val="Hyperlink"/>
@@ -226,7 +226,7 @@
         </w:numPr>
         <w:spacing w:after="60"/>
       </w:pPr>
-      <w:hyperlink w:history="1" r:id="rIddizkgfi0tx3elhhbamto7">
+      <w:hyperlink w:history="1" r:id="rIdbw9y_kgo0d4ppzj8hz4h_">
         <w:r>
           <w:rPr>
             <w:rStyle w:val="Hyperlink"/>
@@ -247,7 +247,7 @@
         </w:numPr>
         <w:spacing w:after="60"/>
       </w:pPr>
-      <w:hyperlink w:history="1" r:id="rIdm2s7tged790irqajurvfd">
+      <w:hyperlink w:history="1" r:id="rIdgtaxeoqppevdxfp6guhu-">
         <w:r>
           <w:rPr>
             <w:rStyle w:val="Hyperlink"/>
@@ -291,7 +291,7 @@
         </w:rPr>
         <w:t xml:space="preserve">We are starting to use Scribeberry, and we hold licenses that will be active for you during your shift. Please set up your account now — setup instructions and a tutorial are on the website: </w:t>
       </w:r>
-      <w:hyperlink w:history="1" r:id="rIdgnfe8vg47bvjepo9hihdr">
+      <w:hyperlink w:history="1" r:id="rIdt2yszoogkwdfbxxzpiu0r">
         <w:r>
           <w:rPr>
             <w:rStyle w:val="Hyperlink"/>
@@ -308,7 +308,7 @@
           <w:sz w:val="22"/>
           <w:szCs w:val="22"/>
         </w:rPr>
-        <w:t xml:space="preserve">. The PAs on the team are already familiar with Scribeberry, but we think the website tutorial will be helpful to everyone.</w:t>
+        <w:t xml:space="preserve">. The PAs on the team are already familiar with Scribeberry and can help you get started, but we think the website tutorial will be helpful to everyone as they begin.</w:t>
       </w:r>
     </w:p>
     <w:p>
@@ -328,17 +328,17 @@
           <w:sz w:val="22"/>
           <w:szCs w:val="22"/>
         </w:rPr>
-        <w:t xml:space="preserve">Working with our PAs. </w:t>
-      </w:r>
-      <w:r>
-        <w:rPr>
-          <w:rFonts w:ascii="Calibri" w:cs="Calibri" w:eastAsia="Calibri" w:hAnsi="Calibri"/>
-          <w:sz w:val="22"/>
-          <w:szCs w:val="22"/>
-        </w:rPr>
-        <w:t xml:space="preserve">We are asking team members to be responsible about how they work with the PAs. Using them just as scribes is not thoughtful — they are experts who will be doing at least an initial assessment independently, and you have the option of doing other assessments on your own. Note that using Scribeberry is expected to give you the same boost as a PA who was merely doing your notes. Our philosophy is described here: </w:t>
-      </w:r>
-      <w:hyperlink w:history="1" r:id="rIdaueiulhymeoajeskf74pl">
+        <w:t xml:space="preserve">Working with our Physician Assistants. </w:t>
+      </w:r>
+      <w:r>
+        <w:rPr>
+          <w:rFonts w:ascii="Calibri" w:cs="Calibri" w:eastAsia="Calibri" w:hAnsi="Calibri"/>
+          <w:sz w:val="22"/>
+          <w:szCs w:val="22"/>
+        </w:rPr>
+        <w:t xml:space="preserve">We are asking team members to be responsible with how they work with the PAs. Using them just as scribes is less effective — they are experts in assessment and treatment planning who should typically be doing at least an initial assessment independently, and at that time you have the option of doing other assessments, on your own. Note that using Scribeberry is expected to give you the same boost as having a PA who is merely doing your notes. Our philosophy is described here: </w:t>
+      </w:r>
+      <w:hyperlink w:history="1" r:id="rIdtwyok_xzu079nxbmugcpp">
         <w:r>
           <w:rPr>
             <w:rStyle w:val="Hyperlink"/>
@@ -385,7 +385,7 @@
         </w:rPr>
         <w:t xml:space="preserve">Psychiatrists who have activated all of the above and completed the </w:t>
       </w:r>
-      <w:hyperlink w:history="1" r:id="rIdbquuitlszugz8zhrpi_nv">
+      <w:hyperlink w:history="1" r:id="rIdy14nsgfc_kk4ii0sbucd4">
         <w:r>
           <w:rPr>
             <w:rStyle w:val="Hyperlink"/>
@@ -432,7 +432,7 @@
         </w:rPr>
         <w:t xml:space="preserve">Finally, please submit your requests using the request form we have made: </w:t>
       </w:r>
-      <w:hyperlink w:history="1" r:id="rIdg46pwcjwhksh5gez_jgap">
+      <w:hyperlink w:history="1" r:id="rIdzt0rl-vsnzu8f09qxhkwo">
         <w:r>
           <w:rPr>
             <w:rStyle w:val="Hyperlink"/>

</xml_diff>

<commit_message>
Update site (2026-07-30 12:08)
</commit_message>
<xml_diff>
--- a/email-psychiatrists-shift-requests.docx
+++ b/email-psychiatrists-shift-requests.docx
@@ -14,7 +14,7 @@
           <w:sz w:val="22"/>
           <w:szCs w:val="22"/>
         </w:rPr>
-        <w:t xml:space="preserve">Subject: PVCS — A few things before you submit shift requests for the next schedule</w:t>
+        <w:t>Subject: PVCS - Important changes before next shift requests - Action required</w:t>
       </w:r>
     </w:p>
     <w:p>
@@ -49,18 +49,17 @@
           <w:bCs/>
           <w:sz w:val="22"/>
           <w:szCs w:val="22"/>
-          <w:highlight w:val="yellow"/>
           <w:highlightCs w:val="yellow"/>
         </w:rPr>
-        <w:t xml:space="preserve">[START DATE] to [END DATE]</w:t>
-      </w:r>
-      <w:r>
-        <w:rPr>
-          <w:rFonts w:ascii="Calibri" w:cs="Calibri" w:eastAsia="Calibri" w:hAnsi="Calibri"/>
-          <w:sz w:val="22"/>
-          <w:szCs w:val="22"/>
-        </w:rPr>
-        <w:t xml:space="preserve">), we are introducing some things that we think will benefit the service.</w:t>
+        <w:t>September 11 to November 8, 2026</w:t>
+      </w:r>
+      <w:r>
+        <w:rPr>
+          <w:rFonts w:ascii="Calibri" w:cs="Calibri" w:eastAsia="Calibri" w:hAnsi="Calibri"/>
+          <w:sz w:val="22"/>
+          <w:szCs w:val="22"/>
+        </w:rPr>
+        <w:t>), we are making changes to our processes that we think will benefit the service.</w:t>
       </w:r>
     </w:p>
     <w:p>
@@ -80,7 +79,7 @@
           <w:sz w:val="22"/>
           <w:szCs w:val="22"/>
         </w:rPr>
-        <w:t xml:space="preserve">Program setup. </w:t>
+        <w:t xml:space="preserve">Computer programs setup. </w:t>
       </w:r>
       <w:r>
         <w:rPr>
@@ -374,6 +373,7 @@
           <w:bCs/>
           <w:sz w:val="22"/>
           <w:szCs w:val="22"/>
+          <w:highlight w:val="yellow"/>
         </w:rPr>
         <w:t xml:space="preserve">Scheduling priority. </w:t>
       </w:r>
@@ -382,16 +382,19 @@
           <w:rFonts w:ascii="Calibri" w:cs="Calibri" w:eastAsia="Calibri" w:hAnsi="Calibri"/>
           <w:sz w:val="22"/>
           <w:szCs w:val="22"/>
-        </w:rPr>
-        <w:t xml:space="preserve">Psychiatrists who have activated all of the above and completed the </w:t>
+          <w:highlight w:val="yellow"/>
+        </w:rPr>
+        <w:t xml:space="preserve">Psychiatrists who have activated all of the computer programs above and completed the </w:t>
       </w:r>
       <w:hyperlink w:history="1" r:id="rIdy14nsgfc_kk4ii0sbucd4">
         <w:r>
           <w:rPr>
             <w:rStyle w:val="Hyperlink"/>
             <w:rFonts w:ascii="Calibri" w:cs="Calibri" w:eastAsia="Calibri" w:hAnsi="Calibri"/>
-            <w:sz w:val="22"/>
-            <w:szCs w:val="22"/>
+            <w:b/>
+            <w:sz w:val="22"/>
+            <w:szCs w:val="22"/>
+            <w:highlight w:val="yellow"/>
           </w:rPr>
           <w:t xml:space="preserve">onboarding form</w:t>
         </w:r>
@@ -401,8 +404,28 @@
           <w:rFonts w:ascii="Calibri" w:cs="Calibri" w:eastAsia="Calibri" w:hAnsi="Calibri"/>
           <w:sz w:val="22"/>
           <w:szCs w:val="22"/>
+          <w:highlight w:val="yellow"/>
         </w:rPr>
         <w:t xml:space="preserve"> acknowledging it will have first priority when we make the schedule.</w:t>
+      </w:r>
+    </w:p>
+    <w:p>
+      <w:pPr>
+        <w:pStyle w:val="ListParagraph"/>
+        <w:numPr>
+          <w:ilvl w:val="0"/>
+          <w:numId w:val="2"/>
+        </w:numPr>
+        <w:spacing w:after="160"/>
+      </w:pPr>
+      <w:r>
+        <w:rPr>
+          <w:b/>
+        </w:rPr>
+        <w:t xml:space="preserve">Revisiting time requirement in the near future. </w:t>
+      </w:r>
+      <w:r>
+        <w:t>We will be revisiting the times that psychiatrists are available for direct assessment of patients while on service. We have found that having availability immediately after the morning handover meeting, and again at the end of the shift to help complete work that remains outstanding from the day shift, is most beneficial. We will keep you informed as we work to improve our processes.</w:t>
       </w:r>
     </w:p>
     <w:p>
@@ -454,15 +477,34 @@
     </w:p>
     <w:p>
       <w:pPr>
-        <w:spacing w:after="160"/>
-      </w:pPr>
-      <w:r>
-        <w:rPr>
-          <w:rFonts w:ascii="Calibri" w:cs="Calibri" w:eastAsia="Calibri" w:hAnsi="Calibri"/>
-          <w:sz w:val="22"/>
-          <w:szCs w:val="22"/>
-        </w:rPr>
-        <w:t xml:space="preserve">Thank you for everything you do for the service.</w:t>
+        <w:pStyle w:val="ListParagraph"/>
+        <w:numPr>
+          <w:ilvl w:val="0"/>
+          <w:numId w:val="2"/>
+        </w:numPr>
+        <w:spacing w:after="160"/>
+      </w:pPr>
+      <w:r>
+        <w:rPr>
+          <w:b/>
+        </w:rPr>
+        <w:t xml:space="preserve">Anticipated future scheduling periods. </w:t>
+      </w:r>
+      <w:r>
+        <w:t>We anticipate increasing the period of time over which we create schedules, for the next times we make requests, starting in November. The proposed scheduling periods will be November 8, 2026 - January 3, 2027; January 4, 2027 - June 27, 2027; June 28, 2027 - September 19, 2027; and September 19, 2027 - January 2, 2028. Details will be finalized before the next schedule requests are distributed (approximately late September).</w:t>
+      </w:r>
+    </w:p>
+    <w:p>
+      <w:pPr>
+        <w:spacing w:after="160"/>
+      </w:pPr>
+      <w:r>
+        <w:rPr>
+          <w:rFonts w:ascii="Calibri" w:cs="Calibri" w:eastAsia="Calibri" w:hAnsi="Calibri"/>
+          <w:sz w:val="22"/>
+          <w:szCs w:val="22"/>
+        </w:rPr>
+        <w:t>Thank you for your work with the service.</w:t>
       </w:r>
     </w:p>
     <w:p>
@@ -488,7 +530,21 @@
           <w:sz w:val="22"/>
           <w:szCs w:val="22"/>
         </w:rPr>
-        <w:t xml:space="preserve">Mike Harrington</w:t>
+        <w:t>Michael Harrington MD, FRCPC (he/him)</w:t>
+        <w:br/>
+        <w:t/>
+        <w:br/>
+        <w:t>Associate Professor</w:t>
+        <w:br/>
+        <w:t>PVCS Associate Medical Director</w:t>
+        <w:br/>
+        <w:t>Department of Psychiatry, Max Rady College of Medicine</w:t>
+        <w:br/>
+        <w:t>University of Manitoba | Rady Faculty of Health Sciences</w:t>
+        <w:br/>
+        <w:t>ph: (204)787-3610</w:t>
+        <w:br/>
+        <w:t>fax: (204)787-4879</w:t>
       </w:r>
     </w:p>
     <w:sectPr>

</xml_diff>